<commit_message>
Aufgabe 6 noch geantwortet
</commit_message>
<xml_diff>
--- a/Unterricht/src/T37_HeapStackGC/garbageCollector/GarabageCollectorAufgaben_MaksimScheierman.docx
+++ b/Unterricht/src/T37_HeapStackGC/garbageCollector/GarabageCollectorAufgaben_MaksimScheierman.docx
@@ -4757,6 +4757,183 @@
       <w:r>
         <w:t>Erklärung</w:t>
       </w:r>
+      <w:r>
+        <w:t>:</w:t>
+      </w:r>
+    </w:p>
+    <w:p>
+      <w:r>
+        <w:t xml:space="preserve">Im Programm werden insgesamt drei Wind-Objekte erzeugt: </w:t>
+      </w:r>
+      <w:proofErr w:type="spellStart"/>
+      <w:r>
+        <w:t>new</w:t>
+      </w:r>
+      <w:proofErr w:type="spellEnd"/>
+      <w:r>
+        <w:t xml:space="preserve"> </w:t>
+      </w:r>
+      <w:proofErr w:type="gramStart"/>
+      <w:r>
+        <w:t>Wind(</w:t>
+      </w:r>
+      <w:proofErr w:type="gramEnd"/>
+      <w:r>
+        <w:t xml:space="preserve">3), </w:t>
+      </w:r>
+      <w:proofErr w:type="spellStart"/>
+      <w:r>
+        <w:t>new</w:t>
+      </w:r>
+      <w:proofErr w:type="spellEnd"/>
+      <w:r>
+        <w:t xml:space="preserve"> </w:t>
+      </w:r>
+      <w:proofErr w:type="gramStart"/>
+      <w:r>
+        <w:t>Wind(</w:t>
+      </w:r>
+      <w:proofErr w:type="gramEnd"/>
+      <w:r>
+        <w:t xml:space="preserve">1) und </w:t>
+      </w:r>
+      <w:proofErr w:type="spellStart"/>
+      <w:r>
+        <w:t>new</w:t>
+      </w:r>
+      <w:proofErr w:type="spellEnd"/>
+      <w:r>
+        <w:t xml:space="preserve"> </w:t>
+      </w:r>
+      <w:proofErr w:type="gramStart"/>
+      <w:r>
+        <w:t>Wind(</w:t>
+      </w:r>
+      <w:proofErr w:type="gramEnd"/>
+      <w:r>
+        <w:t xml:space="preserve">2). Das Objekt </w:t>
+      </w:r>
+      <w:proofErr w:type="spellStart"/>
+      <w:r>
+        <w:t>new</w:t>
+      </w:r>
+      <w:proofErr w:type="spellEnd"/>
+      <w:r>
+        <w:t xml:space="preserve"> </w:t>
+      </w:r>
+      <w:proofErr w:type="gramStart"/>
+      <w:r>
+        <w:t>Wind(</w:t>
+      </w:r>
+      <w:proofErr w:type="gramEnd"/>
+      <w:r>
+        <w:t xml:space="preserve">3) wird im Ausdruck </w:t>
+      </w:r>
+      <w:proofErr w:type="spellStart"/>
+      <w:r>
+        <w:t>new</w:t>
+      </w:r>
+      <w:proofErr w:type="spellEnd"/>
+      <w:r>
+        <w:t xml:space="preserve"> Wind(3</w:t>
+      </w:r>
+      <w:proofErr w:type="gramStart"/>
+      <w:r>
+        <w:t>).</w:t>
+      </w:r>
+      <w:proofErr w:type="spellStart"/>
+      <w:r>
+        <w:t>go</w:t>
+      </w:r>
+      <w:proofErr w:type="spellEnd"/>
+      <w:proofErr w:type="gramEnd"/>
+      <w:r>
+        <w:t>() erzeugt und sofort benutzt. Da keine Variable dieses Objekt speichert, geht die einzige temporäre Referenz nach Ende des Methodenaufrufs verloren. Das Objekt ist damit nicht mehr erreichbar.</w:t>
+      </w:r>
+    </w:p>
+    <w:p>
+      <w:r>
+        <w:t xml:space="preserve">Innerhalb der Methode </w:t>
+      </w:r>
+      <w:proofErr w:type="spellStart"/>
+      <w:proofErr w:type="gramStart"/>
+      <w:r>
+        <w:t>go</w:t>
+      </w:r>
+      <w:proofErr w:type="spellEnd"/>
+      <w:r>
+        <w:t>(</w:t>
+      </w:r>
+      <w:proofErr w:type="gramEnd"/>
+      <w:r>
+        <w:t>) werden zwei weitere Objekte (</w:t>
+      </w:r>
+      <w:proofErr w:type="spellStart"/>
+      <w:r>
+        <w:t>new</w:t>
+      </w:r>
+      <w:proofErr w:type="spellEnd"/>
+      <w:r>
+        <w:t xml:space="preserve"> </w:t>
+      </w:r>
+      <w:proofErr w:type="gramStart"/>
+      <w:r>
+        <w:t>Wind(</w:t>
+      </w:r>
+      <w:proofErr w:type="gramEnd"/>
+      <w:r>
+        <w:t xml:space="preserve">1) und </w:t>
+      </w:r>
+      <w:proofErr w:type="spellStart"/>
+      <w:r>
+        <w:t>new</w:t>
+      </w:r>
+      <w:proofErr w:type="spellEnd"/>
+      <w:r>
+        <w:t xml:space="preserve"> </w:t>
+      </w:r>
+      <w:proofErr w:type="gramStart"/>
+      <w:r>
+        <w:t>Wind(</w:t>
+      </w:r>
+      <w:proofErr w:type="gramEnd"/>
+      <w:r>
+        <w:t xml:space="preserve">2)) durch die lokalen Variablen w1 und w2 referenziert. Nach dem Verlassen der Methode wird der gesamte Stack-Frame von </w:t>
+      </w:r>
+      <w:proofErr w:type="spellStart"/>
+      <w:proofErr w:type="gramStart"/>
+      <w:r>
+        <w:t>go</w:t>
+      </w:r>
+      <w:proofErr w:type="spellEnd"/>
+      <w:r>
+        <w:t>(</w:t>
+      </w:r>
+      <w:proofErr w:type="gramEnd"/>
+      <w:r>
+        <w:t>) gelöscht; die Variablen w1 und w2 existieren nicht mehr. Dadurch gibt es keine Referenzen mehr auf diese beiden Objekte.</w:t>
+      </w:r>
+    </w:p>
+    <w:p>
+      <w:r>
+        <w:t xml:space="preserve">Somit sind nach Abschluss des Programmcodes alle drei erzeugten Wind-Objekte für den </w:t>
+      </w:r>
+      <w:proofErr w:type="spellStart"/>
+      <w:r>
+        <w:t>Garbage</w:t>
+      </w:r>
+      <w:proofErr w:type="spellEnd"/>
+      <w:r>
+        <w:t xml:space="preserve"> </w:t>
+      </w:r>
+      <w:proofErr w:type="spellStart"/>
+      <w:r>
+        <w:t>Collector</w:t>
+      </w:r>
+      <w:proofErr w:type="spellEnd"/>
+      <w:r>
+        <w:t xml:space="preserve"> verfügbar.</w:t>
+      </w:r>
     </w:p>
     <w:p/>
     <w:p/>
@@ -4773,6 +4950,7 @@
     <w:p/>
     <w:p/>
     <w:p/>
+    <w:p/>
     <w:p>
       <w:r>
         <w:t>Aufgabe 7:</w:t>
@@ -5696,18 +5874,6 @@
           <w14:ligatures w14:val="none"/>
         </w:rPr>
         <w:br/>
-      </w:r>
-      <w:r>
-        <w:rPr>
-          <w:rFonts w:ascii="Courier New" w:eastAsia="Times New Roman" w:hAnsi="Courier New" w:cs="Courier New"/>
-          <w:color w:val="BCBEC4"/>
-          <w:kern w:val="0"/>
-          <w:sz w:val="20"/>
-          <w:szCs w:val="20"/>
-          <w:lang w:eastAsia="de-DE"/>
-          <w14:ligatures w14:val="none"/>
-        </w:rPr>
-        <w:lastRenderedPageBreak/>
         <w:t xml:space="preserve">        c1 = </w:t>
       </w:r>
       <w:r>

</xml_diff>

<commit_message>
Aufgabe 7 noch geantwortet
</commit_message>
<xml_diff>
--- a/Unterricht/src/T37_HeapStackGC/garbageCollector/GarabageCollectorAufgaben_MaksimScheierman.docx
+++ b/Unterricht/src/T37_HeapStackGC/garbageCollector/GarabageCollectorAufgaben_MaksimScheierman.docx
@@ -107,26 +107,10 @@
         <w:t>Stack</w:t>
       </w:r>
       <w:r>
-        <w:t xml:space="preserve"> gespeichert. Beim Aufruf einer Methode legt die JVM einen neuen Stack-Frame im Speicher an, in dem alle lokalen Variablen und Parameter dieser Methode gespeichert werden. </w:t>
-      </w:r>
-      <w:proofErr w:type="gramStart"/>
-      <w:r>
-        <w:t>Der Stack</w:t>
-      </w:r>
-      <w:proofErr w:type="gramEnd"/>
-      <w:r>
-        <w:t xml:space="preserve"> arbeitet nach dem LIFO-Prinzip (Last In – First Out</w:t>
-      </w:r>
-      <w:proofErr w:type="gramStart"/>
-      <w:r>
-        <w:t>).</w:t>
-      </w:r>
-      <w:r>
-        <w:t>Wo</w:t>
-      </w:r>
-      <w:proofErr w:type="gramEnd"/>
-      <w:r>
-        <w:t xml:space="preserve"> werden Objekte gespeichert?</w:t>
+        <w:t xml:space="preserve"> gespeichert. Beim Aufruf einer Methode legt die JVM einen neuen Stack-Frame im Speicher an, in dem alle lokalen Variablen und Parameter dieser Methode gespeichert werden. Der Stack arbeitet nach dem LIFO-Prinzip (Last In – First Out).</w:t>
+      </w:r>
+      <w:r>
+        <w:t>Wo werden Objekte gespeichert?</w:t>
       </w:r>
     </w:p>
     <w:p>
@@ -817,7 +801,6 @@
         <w:t xml:space="preserve"> </w:t>
       </w:r>
       <w:proofErr w:type="spellStart"/>
-      <w:proofErr w:type="gramStart"/>
       <w:r>
         <w:rPr>
           <w:rFonts w:ascii="Courier New" w:eastAsia="Times New Roman" w:hAnsi="Courier New" w:cs="Courier New"/>
@@ -841,20 +824,7 @@
           <w:lang w:eastAsia="de-DE"/>
           <w14:ligatures w14:val="none"/>
         </w:rPr>
-        <w:t>(String[</w:t>
-      </w:r>
-      <w:proofErr w:type="gramEnd"/>
-      <w:r>
-        <w:rPr>
-          <w:rFonts w:ascii="Courier New" w:eastAsia="Times New Roman" w:hAnsi="Courier New" w:cs="Courier New"/>
-          <w:color w:val="BCBEC4"/>
-          <w:kern w:val="0"/>
-          <w:sz w:val="20"/>
-          <w:szCs w:val="20"/>
-          <w:lang w:eastAsia="de-DE"/>
-          <w14:ligatures w14:val="none"/>
-        </w:rPr>
-        <w:t xml:space="preserve">] </w:t>
+        <w:t xml:space="preserve">(String[] </w:t>
       </w:r>
       <w:proofErr w:type="spellStart"/>
       <w:r>
@@ -948,7 +918,6 @@
         <w:t xml:space="preserve"> </w:t>
       </w:r>
       <w:proofErr w:type="spellStart"/>
-      <w:proofErr w:type="gramStart"/>
       <w:r>
         <w:rPr>
           <w:rFonts w:ascii="Courier New" w:eastAsia="Times New Roman" w:hAnsi="Courier New" w:cs="Courier New"/>
@@ -972,20 +941,7 @@
           <w:lang w:eastAsia="de-DE"/>
           <w14:ligatures w14:val="none"/>
         </w:rPr>
-        <w:t>(</w:t>
-      </w:r>
-      <w:proofErr w:type="gramEnd"/>
-      <w:r>
-        <w:rPr>
-          <w:rFonts w:ascii="Courier New" w:eastAsia="Times New Roman" w:hAnsi="Courier New" w:cs="Courier New"/>
-          <w:color w:val="BCBEC4"/>
-          <w:kern w:val="0"/>
-          <w:sz w:val="20"/>
-          <w:szCs w:val="20"/>
-          <w:lang w:eastAsia="de-DE"/>
-          <w14:ligatures w14:val="none"/>
-        </w:rPr>
-        <w:t>);</w:t>
+        <w:t>();</w:t>
       </w:r>
       <w:r>
         <w:rPr>
@@ -1053,7 +1009,6 @@
         <w:t xml:space="preserve"> </w:t>
       </w:r>
       <w:proofErr w:type="spellStart"/>
-      <w:proofErr w:type="gramStart"/>
       <w:r>
         <w:rPr>
           <w:rFonts w:ascii="Courier New" w:eastAsia="Times New Roman" w:hAnsi="Courier New" w:cs="Courier New"/>
@@ -1077,20 +1032,7 @@
           <w:lang w:eastAsia="de-DE"/>
           <w14:ligatures w14:val="none"/>
         </w:rPr>
-        <w:t>(</w:t>
-      </w:r>
-      <w:proofErr w:type="gramEnd"/>
-      <w:r>
-        <w:rPr>
-          <w:rFonts w:ascii="Courier New" w:eastAsia="Times New Roman" w:hAnsi="Courier New" w:cs="Courier New"/>
-          <w:color w:val="BCBEC4"/>
-          <w:kern w:val="0"/>
-          <w:sz w:val="20"/>
-          <w:szCs w:val="20"/>
-          <w:lang w:eastAsia="de-DE"/>
-          <w14:ligatures w14:val="none"/>
-        </w:rPr>
-        <w:t>);</w:t>
+        <w:t>();</w:t>
       </w:r>
       <w:r>
         <w:rPr>
@@ -1158,7 +1100,6 @@
         <w:t xml:space="preserve"> </w:t>
       </w:r>
       <w:proofErr w:type="spellStart"/>
-      <w:proofErr w:type="gramStart"/>
       <w:r>
         <w:rPr>
           <w:rFonts w:ascii="Courier New" w:eastAsia="Times New Roman" w:hAnsi="Courier New" w:cs="Courier New"/>
@@ -1182,20 +1123,7 @@
           <w:lang w:eastAsia="de-DE"/>
           <w14:ligatures w14:val="none"/>
         </w:rPr>
-        <w:t>(</w:t>
-      </w:r>
-      <w:proofErr w:type="gramEnd"/>
-      <w:r>
-        <w:rPr>
-          <w:rFonts w:ascii="Courier New" w:eastAsia="Times New Roman" w:hAnsi="Courier New" w:cs="Courier New"/>
-          <w:color w:val="BCBEC4"/>
-          <w:kern w:val="0"/>
-          <w:sz w:val="20"/>
-          <w:szCs w:val="20"/>
-          <w:lang w:eastAsia="de-DE"/>
-          <w14:ligatures w14:val="none"/>
-        </w:rPr>
-        <w:t>);</w:t>
+        <w:t>();</w:t>
       </w:r>
       <w:r>
         <w:rPr>
@@ -1454,22 +1382,8 @@
           <w14:ligatures w14:val="none"/>
         </w:rPr>
         <w:br/>
-        <w:t xml:space="preserve">  </w:t>
-      </w:r>
-      <w:proofErr w:type="gramStart"/>
-      <w:r>
-        <w:rPr>
-          <w:rFonts w:ascii="Courier New" w:eastAsia="Times New Roman" w:hAnsi="Courier New" w:cs="Courier New"/>
-          <w:color w:val="BCBEC4"/>
-          <w:kern w:val="0"/>
-          <w:sz w:val="20"/>
-          <w:szCs w:val="20"/>
-          <w:lang w:eastAsia="de-DE"/>
-          <w14:ligatures w14:val="none"/>
-        </w:rPr>
-        <w:t xml:space="preserve">  }</w:t>
-      </w:r>
-      <w:proofErr w:type="gramEnd"/>
+        <w:t xml:space="preserve">    }</w:t>
+      </w:r>
       <w:r>
         <w:rPr>
           <w:rFonts w:ascii="Courier New" w:eastAsia="Times New Roman" w:hAnsi="Courier New" w:cs="Courier New"/>
@@ -1697,7 +1611,6 @@
         </w:rPr>
         <w:t xml:space="preserve"> </w:t>
       </w:r>
-      <w:proofErr w:type="gramStart"/>
       <w:r>
         <w:rPr>
           <w:rFonts w:ascii="Courier New" w:eastAsia="Times New Roman" w:hAnsi="Courier New" w:cs="Courier New"/>
@@ -1710,7 +1623,6 @@
         </w:rPr>
         <w:t>Beta{ }</w:t>
       </w:r>
-      <w:proofErr w:type="gramEnd"/>
       <w:r>
         <w:rPr>
           <w:rFonts w:ascii="Courier New" w:eastAsia="Times New Roman" w:hAnsi="Courier New" w:cs="Courier New"/>
@@ -1749,7 +1661,6 @@
         </w:rPr>
         <w:t xml:space="preserve"> </w:t>
       </w:r>
-      <w:proofErr w:type="gramStart"/>
       <w:r>
         <w:rPr>
           <w:rFonts w:ascii="Courier New" w:eastAsia="Times New Roman" w:hAnsi="Courier New" w:cs="Courier New"/>
@@ -1762,7 +1673,6 @@
         </w:rPr>
         <w:t>Alpha{</w:t>
       </w:r>
-      <w:proofErr w:type="gramEnd"/>
       <w:r>
         <w:rPr>
           <w:rFonts w:ascii="Courier New" w:eastAsia="Times New Roman" w:hAnsi="Courier New" w:cs="Courier New"/>
@@ -2072,7 +1982,6 @@
         <w:t xml:space="preserve"> </w:t>
       </w:r>
       <w:proofErr w:type="spellStart"/>
-      <w:proofErr w:type="gramStart"/>
       <w:r>
         <w:rPr>
           <w:rFonts w:ascii="Courier New" w:eastAsia="Times New Roman" w:hAnsi="Courier New" w:cs="Courier New"/>
@@ -2096,20 +2005,7 @@
           <w:lang w:eastAsia="de-DE"/>
           <w14:ligatures w14:val="none"/>
         </w:rPr>
-        <w:t>(String[</w:t>
-      </w:r>
-      <w:proofErr w:type="gramEnd"/>
-      <w:r>
-        <w:rPr>
-          <w:rFonts w:ascii="Courier New" w:eastAsia="Times New Roman" w:hAnsi="Courier New" w:cs="Courier New"/>
-          <w:color w:val="BCBEC4"/>
-          <w:kern w:val="0"/>
-          <w:sz w:val="20"/>
-          <w:szCs w:val="20"/>
-          <w:lang w:eastAsia="de-DE"/>
-          <w14:ligatures w14:val="none"/>
-        </w:rPr>
-        <w:t xml:space="preserve">] </w:t>
+        <w:t xml:space="preserve">(String[] </w:t>
       </w:r>
       <w:proofErr w:type="spellStart"/>
       <w:r>
@@ -2176,31 +2072,17 @@
         </w:rPr>
         <w:t xml:space="preserve"> </w:t>
       </w:r>
-      <w:proofErr w:type="gramStart"/>
-      <w:r>
-        <w:rPr>
-          <w:rFonts w:ascii="Courier New" w:eastAsia="Times New Roman" w:hAnsi="Courier New" w:cs="Courier New"/>
-          <w:color w:val="BCBEC4"/>
-          <w:kern w:val="0"/>
-          <w:sz w:val="20"/>
-          <w:szCs w:val="20"/>
-          <w:lang w:eastAsia="de-DE"/>
-          <w14:ligatures w14:val="none"/>
-        </w:rPr>
-        <w:t>Beta(</w:t>
-      </w:r>
-      <w:proofErr w:type="gramEnd"/>
-      <w:r>
-        <w:rPr>
-          <w:rFonts w:ascii="Courier New" w:eastAsia="Times New Roman" w:hAnsi="Courier New" w:cs="Courier New"/>
-          <w:color w:val="BCBEC4"/>
-          <w:kern w:val="0"/>
-          <w:sz w:val="20"/>
-          <w:szCs w:val="20"/>
-          <w:lang w:eastAsia="de-DE"/>
-          <w14:ligatures w14:val="none"/>
-        </w:rPr>
-        <w:t>);</w:t>
+      <w:r>
+        <w:rPr>
+          <w:rFonts w:ascii="Courier New" w:eastAsia="Times New Roman" w:hAnsi="Courier New" w:cs="Courier New"/>
+          <w:color w:val="BCBEC4"/>
+          <w:kern w:val="0"/>
+          <w:sz w:val="20"/>
+          <w:szCs w:val="20"/>
+          <w:lang w:eastAsia="de-DE"/>
+          <w14:ligatures w14:val="none"/>
+        </w:rPr>
+        <w:t>Beta();</w:t>
       </w:r>
       <w:r>
         <w:rPr>
@@ -2241,31 +2123,17 @@
         </w:rPr>
         <w:t xml:space="preserve"> </w:t>
       </w:r>
-      <w:proofErr w:type="gramStart"/>
-      <w:r>
-        <w:rPr>
-          <w:rFonts w:ascii="Courier New" w:eastAsia="Times New Roman" w:hAnsi="Courier New" w:cs="Courier New"/>
-          <w:color w:val="BCBEC4"/>
-          <w:kern w:val="0"/>
-          <w:sz w:val="20"/>
-          <w:szCs w:val="20"/>
-          <w:lang w:eastAsia="de-DE"/>
-          <w14:ligatures w14:val="none"/>
-        </w:rPr>
-        <w:t>Beta(</w:t>
-      </w:r>
-      <w:proofErr w:type="gramEnd"/>
-      <w:r>
-        <w:rPr>
-          <w:rFonts w:ascii="Courier New" w:eastAsia="Times New Roman" w:hAnsi="Courier New" w:cs="Courier New"/>
-          <w:color w:val="BCBEC4"/>
-          <w:kern w:val="0"/>
-          <w:sz w:val="20"/>
-          <w:szCs w:val="20"/>
-          <w:lang w:eastAsia="de-DE"/>
-          <w14:ligatures w14:val="none"/>
-        </w:rPr>
-        <w:t>);</w:t>
+      <w:r>
+        <w:rPr>
+          <w:rFonts w:ascii="Courier New" w:eastAsia="Times New Roman" w:hAnsi="Courier New" w:cs="Courier New"/>
+          <w:color w:val="BCBEC4"/>
+          <w:kern w:val="0"/>
+          <w:sz w:val="20"/>
+          <w:szCs w:val="20"/>
+          <w:lang w:eastAsia="de-DE"/>
+          <w14:ligatures w14:val="none"/>
+        </w:rPr>
+        <w:t>Beta();</w:t>
       </w:r>
       <w:r>
         <w:rPr>
@@ -2306,31 +2174,17 @@
         </w:rPr>
         <w:t xml:space="preserve"> </w:t>
       </w:r>
-      <w:proofErr w:type="gramStart"/>
-      <w:r>
-        <w:rPr>
-          <w:rFonts w:ascii="Courier New" w:eastAsia="Times New Roman" w:hAnsi="Courier New" w:cs="Courier New"/>
-          <w:color w:val="BCBEC4"/>
-          <w:kern w:val="0"/>
-          <w:sz w:val="20"/>
-          <w:szCs w:val="20"/>
-          <w:lang w:eastAsia="de-DE"/>
-          <w14:ligatures w14:val="none"/>
-        </w:rPr>
-        <w:t>Alpha(</w:t>
-      </w:r>
-      <w:proofErr w:type="gramEnd"/>
-      <w:r>
-        <w:rPr>
-          <w:rFonts w:ascii="Courier New" w:eastAsia="Times New Roman" w:hAnsi="Courier New" w:cs="Courier New"/>
-          <w:color w:val="BCBEC4"/>
-          <w:kern w:val="0"/>
-          <w:sz w:val="20"/>
-          <w:szCs w:val="20"/>
-          <w:lang w:eastAsia="de-DE"/>
-          <w14:ligatures w14:val="none"/>
-        </w:rPr>
-        <w:t>);</w:t>
+      <w:r>
+        <w:rPr>
+          <w:rFonts w:ascii="Courier New" w:eastAsia="Times New Roman" w:hAnsi="Courier New" w:cs="Courier New"/>
+          <w:color w:val="BCBEC4"/>
+          <w:kern w:val="0"/>
+          <w:sz w:val="20"/>
+          <w:szCs w:val="20"/>
+          <w:lang w:eastAsia="de-DE"/>
+          <w14:ligatures w14:val="none"/>
+        </w:rPr>
+        <w:t>Alpha();</w:t>
       </w:r>
       <w:r>
         <w:rPr>
@@ -2371,31 +2225,17 @@
         </w:rPr>
         <w:t xml:space="preserve"> </w:t>
       </w:r>
-      <w:proofErr w:type="gramStart"/>
-      <w:r>
-        <w:rPr>
-          <w:rFonts w:ascii="Courier New" w:eastAsia="Times New Roman" w:hAnsi="Courier New" w:cs="Courier New"/>
-          <w:color w:val="BCBEC4"/>
-          <w:kern w:val="0"/>
-          <w:sz w:val="20"/>
-          <w:szCs w:val="20"/>
-          <w:lang w:eastAsia="de-DE"/>
-          <w14:ligatures w14:val="none"/>
-        </w:rPr>
-        <w:t>Alpha(</w:t>
-      </w:r>
-      <w:proofErr w:type="gramEnd"/>
-      <w:r>
-        <w:rPr>
-          <w:rFonts w:ascii="Courier New" w:eastAsia="Times New Roman" w:hAnsi="Courier New" w:cs="Courier New"/>
-          <w:color w:val="BCBEC4"/>
-          <w:kern w:val="0"/>
-          <w:sz w:val="20"/>
-          <w:szCs w:val="20"/>
-          <w:lang w:eastAsia="de-DE"/>
-          <w14:ligatures w14:val="none"/>
-        </w:rPr>
-        <w:t>);</w:t>
+      <w:r>
+        <w:rPr>
+          <w:rFonts w:ascii="Courier New" w:eastAsia="Times New Roman" w:hAnsi="Courier New" w:cs="Courier New"/>
+          <w:color w:val="BCBEC4"/>
+          <w:kern w:val="0"/>
+          <w:sz w:val="20"/>
+          <w:szCs w:val="20"/>
+          <w:lang w:eastAsia="de-DE"/>
+          <w14:ligatures w14:val="none"/>
+        </w:rPr>
+        <w:t>Alpha();</w:t>
       </w:r>
       <w:r>
         <w:rPr>
@@ -2642,22 +2482,8 @@
           <w14:ligatures w14:val="none"/>
         </w:rPr>
         <w:br/>
-        <w:t xml:space="preserve">  </w:t>
-      </w:r>
-      <w:proofErr w:type="gramStart"/>
-      <w:r>
-        <w:rPr>
-          <w:rFonts w:ascii="Courier New" w:eastAsia="Times New Roman" w:hAnsi="Courier New" w:cs="Courier New"/>
-          <w:color w:val="BCBEC4"/>
-          <w:kern w:val="0"/>
-          <w:sz w:val="20"/>
-          <w:szCs w:val="20"/>
-          <w:lang w:eastAsia="de-DE"/>
-          <w14:ligatures w14:val="none"/>
-        </w:rPr>
-        <w:t xml:space="preserve">  }</w:t>
-      </w:r>
-      <w:proofErr w:type="gramEnd"/>
+        <w:t xml:space="preserve">    }</w:t>
+      </w:r>
       <w:r>
         <w:rPr>
           <w:rFonts w:ascii="Courier New" w:eastAsia="Times New Roman" w:hAnsi="Courier New" w:cs="Courier New"/>
@@ -2969,7 +2795,6 @@
         <w:t xml:space="preserve"> </w:t>
       </w:r>
       <w:proofErr w:type="spellStart"/>
-      <w:proofErr w:type="gramStart"/>
       <w:r>
         <w:rPr>
           <w:rFonts w:ascii="Courier New" w:eastAsia="Times New Roman" w:hAnsi="Courier New" w:cs="Courier New"/>
@@ -2993,20 +2818,7 @@
           <w:lang w:eastAsia="de-DE"/>
           <w14:ligatures w14:val="none"/>
         </w:rPr>
-        <w:t>(String[</w:t>
-      </w:r>
-      <w:proofErr w:type="gramEnd"/>
-      <w:r>
-        <w:rPr>
-          <w:rFonts w:ascii="Courier New" w:eastAsia="Times New Roman" w:hAnsi="Courier New" w:cs="Courier New"/>
-          <w:color w:val="BCBEC4"/>
-          <w:kern w:val="0"/>
-          <w:sz w:val="20"/>
-          <w:szCs w:val="20"/>
-          <w:lang w:eastAsia="de-DE"/>
-          <w14:ligatures w14:val="none"/>
-        </w:rPr>
-        <w:t xml:space="preserve">] </w:t>
+        <w:t xml:space="preserve">(String[] </w:t>
       </w:r>
       <w:proofErr w:type="spellStart"/>
       <w:r>
@@ -3048,7 +2860,6 @@
         <w:t xml:space="preserve">        String </w:t>
       </w:r>
       <w:proofErr w:type="spellStart"/>
-      <w:proofErr w:type="gramStart"/>
       <w:r>
         <w:rPr>
           <w:rFonts w:ascii="Courier New" w:eastAsia="Times New Roman" w:hAnsi="Courier New" w:cs="Courier New"/>
@@ -3062,7 +2873,6 @@
         <w:t>one,two</w:t>
       </w:r>
       <w:proofErr w:type="spellEnd"/>
-      <w:proofErr w:type="gramEnd"/>
       <w:r>
         <w:rPr>
           <w:rFonts w:ascii="Courier New" w:eastAsia="Times New Roman" w:hAnsi="Courier New" w:cs="Courier New"/>
@@ -3481,22 +3291,8 @@
           <w14:ligatures w14:val="none"/>
         </w:rPr>
         <w:br/>
-        <w:t xml:space="preserve">  </w:t>
-      </w:r>
-      <w:proofErr w:type="gramStart"/>
-      <w:r>
-        <w:rPr>
-          <w:rFonts w:ascii="Courier New" w:eastAsia="Times New Roman" w:hAnsi="Courier New" w:cs="Courier New"/>
-          <w:color w:val="BCBEC4"/>
-          <w:kern w:val="0"/>
-          <w:sz w:val="20"/>
-          <w:szCs w:val="20"/>
-          <w:lang w:eastAsia="de-DE"/>
-          <w14:ligatures w14:val="none"/>
-        </w:rPr>
-        <w:t xml:space="preserve">  }</w:t>
-      </w:r>
-      <w:proofErr w:type="gramEnd"/>
+        <w:t xml:space="preserve">    }</w:t>
+      </w:r>
       <w:r>
         <w:rPr>
           <w:rFonts w:ascii="Courier New" w:eastAsia="Times New Roman" w:hAnsi="Courier New" w:cs="Courier New"/>
@@ -3836,7 +3632,6 @@
         <w:br/>
         <w:t xml:space="preserve">    </w:t>
       </w:r>
-      <w:proofErr w:type="gramStart"/>
       <w:r>
         <w:rPr>
           <w:rFonts w:ascii="Courier New" w:eastAsia="Times New Roman" w:hAnsi="Courier New" w:cs="Courier New"/>
@@ -3862,7 +3657,6 @@
         <w:t>(</w:t>
       </w:r>
       <w:proofErr w:type="spellStart"/>
-      <w:proofErr w:type="gramEnd"/>
       <w:r>
         <w:rPr>
           <w:rFonts w:ascii="Courier New" w:eastAsia="Times New Roman" w:hAnsi="Courier New" w:cs="Courier New"/>
@@ -3889,7 +3683,6 @@
         <w:t xml:space="preserve"> </w:t>
       </w:r>
       <w:proofErr w:type="spellStart"/>
-      <w:proofErr w:type="gramStart"/>
       <w:r>
         <w:rPr>
           <w:rFonts w:ascii="Courier New" w:eastAsia="Times New Roman" w:hAnsi="Courier New" w:cs="Courier New"/>
@@ -3915,7 +3708,6 @@
         </w:rPr>
         <w:t>){</w:t>
       </w:r>
-      <w:proofErr w:type="gramEnd"/>
       <w:r>
         <w:rPr>
           <w:rFonts w:ascii="Courier New" w:eastAsia="Times New Roman" w:hAnsi="Courier New" w:cs="Courier New"/>
@@ -4014,22 +3806,8 @@
           <w14:ligatures w14:val="none"/>
         </w:rPr>
         <w:br/>
-        <w:t xml:space="preserve">  </w:t>
-      </w:r>
-      <w:proofErr w:type="gramStart"/>
-      <w:r>
-        <w:rPr>
-          <w:rFonts w:ascii="Courier New" w:eastAsia="Times New Roman" w:hAnsi="Courier New" w:cs="Courier New"/>
-          <w:color w:val="BCBEC4"/>
-          <w:kern w:val="0"/>
-          <w:sz w:val="20"/>
-          <w:szCs w:val="20"/>
-          <w:lang w:eastAsia="de-DE"/>
-          <w14:ligatures w14:val="none"/>
-        </w:rPr>
-        <w:t xml:space="preserve">  }</w:t>
-      </w:r>
-      <w:proofErr w:type="gramEnd"/>
+        <w:t xml:space="preserve">    }</w:t>
+      </w:r>
       <w:r>
         <w:rPr>
           <w:rFonts w:ascii="Courier New" w:eastAsia="Times New Roman" w:hAnsi="Courier New" w:cs="Courier New"/>
@@ -4134,7 +3912,6 @@
         <w:t xml:space="preserve"> </w:t>
       </w:r>
       <w:proofErr w:type="spellStart"/>
-      <w:proofErr w:type="gramStart"/>
       <w:r>
         <w:rPr>
           <w:rFonts w:ascii="Courier New" w:eastAsia="Times New Roman" w:hAnsi="Courier New" w:cs="Courier New"/>
@@ -4158,20 +3935,7 @@
           <w:lang w:eastAsia="de-DE"/>
           <w14:ligatures w14:val="none"/>
         </w:rPr>
-        <w:t>(String[</w:t>
-      </w:r>
-      <w:proofErr w:type="gramEnd"/>
-      <w:r>
-        <w:rPr>
-          <w:rFonts w:ascii="Courier New" w:eastAsia="Times New Roman" w:hAnsi="Courier New" w:cs="Courier New"/>
-          <w:color w:val="BCBEC4"/>
-          <w:kern w:val="0"/>
-          <w:sz w:val="20"/>
-          <w:szCs w:val="20"/>
-          <w:lang w:eastAsia="de-DE"/>
-          <w14:ligatures w14:val="none"/>
-        </w:rPr>
-        <w:t xml:space="preserve">] </w:t>
+        <w:t xml:space="preserve">(String[] </w:t>
       </w:r>
       <w:proofErr w:type="spellStart"/>
       <w:r>
@@ -4262,7 +4026,6 @@
         </w:rPr>
         <w:t>3</w:t>
       </w:r>
-      <w:proofErr w:type="gramStart"/>
       <w:r>
         <w:rPr>
           <w:rFonts w:ascii="Courier New" w:eastAsia="Times New Roman" w:hAnsi="Courier New" w:cs="Courier New"/>
@@ -4289,7 +4052,6 @@
         <w:t>go</w:t>
       </w:r>
       <w:proofErr w:type="spellEnd"/>
-      <w:proofErr w:type="gramEnd"/>
       <w:r>
         <w:rPr>
           <w:rFonts w:ascii="Courier New" w:eastAsia="Times New Roman" w:hAnsi="Courier New" w:cs="Courier New"/>
@@ -4313,22 +4075,8 @@
           <w14:ligatures w14:val="none"/>
         </w:rPr>
         <w:br/>
-        <w:t xml:space="preserve">  </w:t>
-      </w:r>
-      <w:proofErr w:type="gramStart"/>
-      <w:r>
-        <w:rPr>
-          <w:rFonts w:ascii="Courier New" w:eastAsia="Times New Roman" w:hAnsi="Courier New" w:cs="Courier New"/>
-          <w:color w:val="BCBEC4"/>
-          <w:kern w:val="0"/>
-          <w:sz w:val="20"/>
-          <w:szCs w:val="20"/>
-          <w:lang w:eastAsia="de-DE"/>
-          <w14:ligatures w14:val="none"/>
-        </w:rPr>
-        <w:t xml:space="preserve">  }</w:t>
-      </w:r>
-      <w:proofErr w:type="gramEnd"/>
+        <w:t xml:space="preserve">    }</w:t>
+      </w:r>
       <w:r>
         <w:rPr>
           <w:rFonts w:ascii="Courier New" w:eastAsia="Times New Roman" w:hAnsi="Courier New" w:cs="Courier New"/>
@@ -4381,7 +4129,6 @@
         <w:t xml:space="preserve"> </w:t>
       </w:r>
       <w:proofErr w:type="spellStart"/>
-      <w:proofErr w:type="gramStart"/>
       <w:r>
         <w:rPr>
           <w:rFonts w:ascii="Courier New" w:eastAsia="Times New Roman" w:hAnsi="Courier New" w:cs="Courier New"/>
@@ -4407,7 +4154,6 @@
         </w:rPr>
         <w:t>(){</w:t>
       </w:r>
-      <w:proofErr w:type="gramEnd"/>
       <w:r>
         <w:rPr>
           <w:rFonts w:ascii="Courier New" w:eastAsia="Times New Roman" w:hAnsi="Courier New" w:cs="Courier New"/>
@@ -4447,7 +4193,6 @@
         </w:rPr>
         <w:t xml:space="preserve"> </w:t>
       </w:r>
-      <w:proofErr w:type="gramStart"/>
       <w:r>
         <w:rPr>
           <w:rFonts w:ascii="Courier New" w:eastAsia="Times New Roman" w:hAnsi="Courier New" w:cs="Courier New"/>
@@ -4460,7 +4205,6 @@
         </w:rPr>
         <w:t>Wind(</w:t>
       </w:r>
-      <w:proofErr w:type="gramEnd"/>
       <w:r>
         <w:rPr>
           <w:rFonts w:ascii="Courier New" w:eastAsia="Times New Roman" w:hAnsi="Courier New" w:cs="Courier New"/>
@@ -4524,7 +4268,6 @@
         </w:rPr>
         <w:t xml:space="preserve"> </w:t>
       </w:r>
-      <w:proofErr w:type="gramStart"/>
       <w:r>
         <w:rPr>
           <w:rFonts w:ascii="Courier New" w:eastAsia="Times New Roman" w:hAnsi="Courier New" w:cs="Courier New"/>
@@ -4537,7 +4280,6 @@
         </w:rPr>
         <w:t>Wind(</w:t>
       </w:r>
-      <w:proofErr w:type="gramEnd"/>
       <w:r>
         <w:rPr>
           <w:rFonts w:ascii="Courier New" w:eastAsia="Times New Roman" w:hAnsi="Courier New" w:cs="Courier New"/>
@@ -4722,22 +4464,8 @@
           <w14:ligatures w14:val="none"/>
         </w:rPr>
         <w:br/>
-        <w:t xml:space="preserve">  </w:t>
-      </w:r>
-      <w:proofErr w:type="gramStart"/>
-      <w:r>
-        <w:rPr>
-          <w:rFonts w:ascii="Courier New" w:eastAsia="Times New Roman" w:hAnsi="Courier New" w:cs="Courier New"/>
-          <w:color w:val="BCBEC4"/>
-          <w:kern w:val="0"/>
-          <w:sz w:val="20"/>
-          <w:szCs w:val="20"/>
-          <w:lang w:eastAsia="de-DE"/>
-          <w14:ligatures w14:val="none"/>
-        </w:rPr>
-        <w:t xml:space="preserve">  }</w:t>
-      </w:r>
-      <w:proofErr w:type="gramEnd"/>
+        <w:t xml:space="preserve">    }</w:t>
+      </w:r>
       <w:r>
         <w:rPr>
           <w:rFonts w:ascii="Courier New" w:eastAsia="Times New Roman" w:hAnsi="Courier New" w:cs="Courier New"/>
@@ -4771,15 +4499,7 @@
       </w:r>
       <w:proofErr w:type="spellEnd"/>
       <w:r>
-        <w:t xml:space="preserve"> </w:t>
-      </w:r>
-      <w:proofErr w:type="gramStart"/>
-      <w:r>
-        <w:t>Wind(</w:t>
-      </w:r>
-      <w:proofErr w:type="gramEnd"/>
-      <w:r>
-        <w:t xml:space="preserve">3), </w:t>
+        <w:t xml:space="preserve"> Wind(3), </w:t>
       </w:r>
       <w:proofErr w:type="spellStart"/>
       <w:r>
@@ -4787,15 +4507,7 @@
       </w:r>
       <w:proofErr w:type="spellEnd"/>
       <w:r>
-        <w:t xml:space="preserve"> </w:t>
-      </w:r>
-      <w:proofErr w:type="gramStart"/>
-      <w:r>
-        <w:t>Wind(</w:t>
-      </w:r>
-      <w:proofErr w:type="gramEnd"/>
-      <w:r>
-        <w:t xml:space="preserve">1) und </w:t>
+        <w:t xml:space="preserve"> Wind(1) und </w:t>
       </w:r>
       <w:proofErr w:type="spellStart"/>
       <w:r>
@@ -4803,15 +4515,7 @@
       </w:r>
       <w:proofErr w:type="spellEnd"/>
       <w:r>
-        <w:t xml:space="preserve"> </w:t>
-      </w:r>
-      <w:proofErr w:type="gramStart"/>
-      <w:r>
-        <w:t>Wind(</w:t>
-      </w:r>
-      <w:proofErr w:type="gramEnd"/>
-      <w:r>
-        <w:t xml:space="preserve">2). Das Objekt </w:t>
+        <w:t xml:space="preserve"> Wind(2). Das Objekt </w:t>
       </w:r>
       <w:proofErr w:type="spellStart"/>
       <w:r>
@@ -4819,15 +4523,7 @@
       </w:r>
       <w:proofErr w:type="spellEnd"/>
       <w:r>
-        <w:t xml:space="preserve"> </w:t>
-      </w:r>
-      <w:proofErr w:type="gramStart"/>
-      <w:r>
-        <w:t>Wind(</w:t>
-      </w:r>
-      <w:proofErr w:type="gramEnd"/>
-      <w:r>
-        <w:t xml:space="preserve">3) wird im Ausdruck </w:t>
+        <w:t xml:space="preserve"> Wind(3) wird im Ausdruck </w:t>
       </w:r>
       <w:proofErr w:type="spellStart"/>
       <w:r>
@@ -4835,18 +4531,13 @@
       </w:r>
       <w:proofErr w:type="spellEnd"/>
       <w:r>
-        <w:t xml:space="preserve"> Wind(3</w:t>
-      </w:r>
-      <w:proofErr w:type="gramStart"/>
-      <w:r>
-        <w:t>).</w:t>
+        <w:t xml:space="preserve"> Wind(3).</w:t>
       </w:r>
       <w:proofErr w:type="spellStart"/>
       <w:r>
         <w:t>go</w:t>
       </w:r>
       <w:proofErr w:type="spellEnd"/>
-      <w:proofErr w:type="gramEnd"/>
       <w:r>
         <w:t>() erzeugt und sofort benutzt. Da keine Variable dieses Objekt speichert, geht die einzige temporäre Referenz nach Ende des Methodenaufrufs verloren. Das Objekt ist damit nicht mehr erreichbar.</w:t>
       </w:r>
@@ -4856,17 +4547,12 @@
         <w:t xml:space="preserve">Innerhalb der Methode </w:t>
       </w:r>
       <w:proofErr w:type="spellStart"/>
-      <w:proofErr w:type="gramStart"/>
       <w:r>
         <w:t>go</w:t>
       </w:r>
       <w:proofErr w:type="spellEnd"/>
       <w:r>
-        <w:t>(</w:t>
-      </w:r>
-      <w:proofErr w:type="gramEnd"/>
-      <w:r>
-        <w:t>) werden zwei weitere Objekte (</w:t>
+        <w:t>() werden zwei weitere Objekte (</w:t>
       </w:r>
       <w:proofErr w:type="spellStart"/>
       <w:r>
@@ -4874,15 +4560,7 @@
       </w:r>
       <w:proofErr w:type="spellEnd"/>
       <w:r>
-        <w:t xml:space="preserve"> </w:t>
-      </w:r>
-      <w:proofErr w:type="gramStart"/>
-      <w:r>
-        <w:t>Wind(</w:t>
-      </w:r>
-      <w:proofErr w:type="gramEnd"/>
-      <w:r>
-        <w:t xml:space="preserve">1) und </w:t>
+        <w:t xml:space="preserve"> Wind(1) und </w:t>
       </w:r>
       <w:proofErr w:type="spellStart"/>
       <w:r>
@@ -4890,28 +4568,15 @@
       </w:r>
       <w:proofErr w:type="spellEnd"/>
       <w:r>
-        <w:t xml:space="preserve"> </w:t>
-      </w:r>
-      <w:proofErr w:type="gramStart"/>
-      <w:r>
-        <w:t>Wind(</w:t>
-      </w:r>
-      <w:proofErr w:type="gramEnd"/>
-      <w:r>
-        <w:t xml:space="preserve">2)) durch die lokalen Variablen w1 und w2 referenziert. Nach dem Verlassen der Methode wird der gesamte Stack-Frame von </w:t>
-      </w:r>
-      <w:proofErr w:type="spellStart"/>
-      <w:proofErr w:type="gramStart"/>
+        <w:t xml:space="preserve"> Wind(2)) durch die lokalen Variablen w1 und w2 referenziert. Nach dem Verlassen der Methode wird der gesamte Stack-Frame von </w:t>
+      </w:r>
+      <w:proofErr w:type="spellStart"/>
       <w:r>
         <w:t>go</w:t>
       </w:r>
       <w:proofErr w:type="spellEnd"/>
       <w:r>
-        <w:t>(</w:t>
-      </w:r>
-      <w:proofErr w:type="gramEnd"/>
-      <w:r>
-        <w:t>) gelöscht; die Variablen w1 und w2 existieren nicht mehr. Dadurch gibt es keine Referenzen mehr auf diese beiden Objekte.</w:t>
+        <w:t>() gelöscht; die Variablen w1 und w2 existieren nicht mehr. Dadurch gibt es keine Referenzen mehr auf diese beiden Objekte.</w:t>
       </w:r>
     </w:p>
     <w:p>
@@ -4924,15 +4589,7 @@
       </w:r>
       <w:proofErr w:type="spellEnd"/>
       <w:r>
-        <w:t xml:space="preserve"> </w:t>
-      </w:r>
-      <w:proofErr w:type="spellStart"/>
-      <w:r>
-        <w:t>Collector</w:t>
-      </w:r>
-      <w:proofErr w:type="spellEnd"/>
-      <w:r>
-        <w:t xml:space="preserve"> verfügbar.</w:t>
+        <w:t xml:space="preserve"> Collector verfügbar.</w:t>
       </w:r>
     </w:p>
     <w:p/>
@@ -5209,7 +4866,6 @@
         <w:t xml:space="preserve"> </w:t>
       </w:r>
       <w:proofErr w:type="spellStart"/>
-      <w:proofErr w:type="gramStart"/>
       <w:r>
         <w:rPr>
           <w:rFonts w:ascii="Courier New" w:eastAsia="Times New Roman" w:hAnsi="Courier New" w:cs="Courier New"/>
@@ -5236,7 +4892,6 @@
         <w:t>(</w:t>
       </w:r>
       <w:proofErr w:type="spellStart"/>
-      <w:proofErr w:type="gramEnd"/>
       <w:r>
         <w:rPr>
           <w:rFonts w:ascii="Courier New" w:eastAsia="Times New Roman" w:hAnsi="Courier New" w:cs="Courier New"/>
@@ -5263,7 +4918,6 @@
         <w:t xml:space="preserve"> </w:t>
       </w:r>
       <w:proofErr w:type="spellStart"/>
-      <w:proofErr w:type="gramStart"/>
       <w:r>
         <w:rPr>
           <w:rFonts w:ascii="Courier New" w:eastAsia="Times New Roman" w:hAnsi="Courier New" w:cs="Courier New"/>
@@ -5289,7 +4943,6 @@
         </w:rPr>
         <w:t>){</w:t>
       </w:r>
-      <w:proofErr w:type="gramEnd"/>
       <w:r>
         <w:rPr>
           <w:rFonts w:ascii="Courier New" w:eastAsia="Times New Roman" w:hAnsi="Courier New" w:cs="Courier New"/>
@@ -5429,22 +5082,8 @@
           <w14:ligatures w14:val="none"/>
         </w:rPr>
         <w:br/>
-        <w:t xml:space="preserve">  </w:t>
-      </w:r>
-      <w:proofErr w:type="gramStart"/>
-      <w:r>
-        <w:rPr>
-          <w:rFonts w:ascii="Courier New" w:eastAsia="Times New Roman" w:hAnsi="Courier New" w:cs="Courier New"/>
-          <w:color w:val="BCBEC4"/>
-          <w:kern w:val="0"/>
-          <w:sz w:val="20"/>
-          <w:szCs w:val="20"/>
-          <w:lang w:eastAsia="de-DE"/>
-          <w14:ligatures w14:val="none"/>
-        </w:rPr>
-        <w:t xml:space="preserve">  }</w:t>
-      </w:r>
-      <w:proofErr w:type="gramEnd"/>
+        <w:t xml:space="preserve">    }</w:t>
+      </w:r>
       <w:r>
         <w:rPr>
           <w:rFonts w:ascii="Courier New" w:eastAsia="Times New Roman" w:hAnsi="Courier New" w:cs="Courier New"/>
@@ -5549,7 +5188,6 @@
         <w:t xml:space="preserve"> </w:t>
       </w:r>
       <w:proofErr w:type="spellStart"/>
-      <w:proofErr w:type="gramStart"/>
       <w:r>
         <w:rPr>
           <w:rFonts w:ascii="Courier New" w:eastAsia="Times New Roman" w:hAnsi="Courier New" w:cs="Courier New"/>
@@ -5573,20 +5211,7 @@
           <w:lang w:eastAsia="de-DE"/>
           <w14:ligatures w14:val="none"/>
         </w:rPr>
-        <w:t>(String[</w:t>
-      </w:r>
-      <w:proofErr w:type="gramEnd"/>
-      <w:r>
-        <w:rPr>
-          <w:rFonts w:ascii="Courier New" w:eastAsia="Times New Roman" w:hAnsi="Courier New" w:cs="Courier New"/>
-          <w:color w:val="BCBEC4"/>
-          <w:kern w:val="0"/>
-          <w:sz w:val="20"/>
-          <w:szCs w:val="20"/>
-          <w:lang w:eastAsia="de-DE"/>
-          <w14:ligatures w14:val="none"/>
-        </w:rPr>
-        <w:t xml:space="preserve">] </w:t>
+        <w:t xml:space="preserve">(String[] </w:t>
       </w:r>
       <w:proofErr w:type="spellStart"/>
       <w:r>
@@ -5680,7 +5305,6 @@
         <w:t xml:space="preserve"> </w:t>
       </w:r>
       <w:proofErr w:type="spellStart"/>
-      <w:proofErr w:type="gramStart"/>
       <w:r>
         <w:rPr>
           <w:rFonts w:ascii="Courier New" w:eastAsia="Times New Roman" w:hAnsi="Courier New" w:cs="Courier New"/>
@@ -5704,20 +5328,7 @@
           <w:lang w:eastAsia="de-DE"/>
           <w14:ligatures w14:val="none"/>
         </w:rPr>
-        <w:t>(</w:t>
-      </w:r>
-      <w:proofErr w:type="gramEnd"/>
-      <w:r>
-        <w:rPr>
-          <w:rFonts w:ascii="Courier New" w:eastAsia="Times New Roman" w:hAnsi="Courier New" w:cs="Courier New"/>
-          <w:color w:val="BCBEC4"/>
-          <w:kern w:val="0"/>
-          <w:sz w:val="20"/>
-          <w:szCs w:val="20"/>
-          <w:lang w:eastAsia="de-DE"/>
-          <w14:ligatures w14:val="none"/>
-        </w:rPr>
-        <w:t>);</w:t>
+        <w:t>();</w:t>
       </w:r>
       <w:r>
         <w:rPr>
@@ -5785,7 +5396,6 @@
         <w:t xml:space="preserve"> </w:t>
       </w:r>
       <w:proofErr w:type="spellStart"/>
-      <w:proofErr w:type="gramStart"/>
       <w:r>
         <w:rPr>
           <w:rFonts w:ascii="Courier New" w:eastAsia="Times New Roman" w:hAnsi="Courier New" w:cs="Courier New"/>
@@ -5809,20 +5419,7 @@
           <w:lang w:eastAsia="de-DE"/>
           <w14:ligatures w14:val="none"/>
         </w:rPr>
-        <w:t>(</w:t>
-      </w:r>
-      <w:proofErr w:type="gramEnd"/>
-      <w:r>
-        <w:rPr>
-          <w:rFonts w:ascii="Courier New" w:eastAsia="Times New Roman" w:hAnsi="Courier New" w:cs="Courier New"/>
-          <w:color w:val="BCBEC4"/>
-          <w:kern w:val="0"/>
-          <w:sz w:val="20"/>
-          <w:szCs w:val="20"/>
-          <w:lang w:eastAsia="de-DE"/>
-          <w14:ligatures w14:val="none"/>
-        </w:rPr>
-        <w:t>);</w:t>
+        <w:t>();</w:t>
       </w:r>
       <w:r>
         <w:rPr>
@@ -5911,22 +5508,8 @@
           <w14:ligatures w14:val="none"/>
         </w:rPr>
         <w:br/>
-        <w:t xml:space="preserve">  </w:t>
-      </w:r>
-      <w:proofErr w:type="gramStart"/>
-      <w:r>
-        <w:rPr>
-          <w:rFonts w:ascii="Courier New" w:eastAsia="Times New Roman" w:hAnsi="Courier New" w:cs="Courier New"/>
-          <w:color w:val="BCBEC4"/>
-          <w:kern w:val="0"/>
-          <w:sz w:val="20"/>
-          <w:szCs w:val="20"/>
-          <w:lang w:eastAsia="de-DE"/>
-          <w14:ligatures w14:val="none"/>
-        </w:rPr>
-        <w:t xml:space="preserve">  }</w:t>
-      </w:r>
-      <w:proofErr w:type="gramEnd"/>
+        <w:t xml:space="preserve">    }</w:t>
+      </w:r>
       <w:r>
         <w:rPr>
           <w:rFonts w:ascii="Courier New" w:eastAsia="Times New Roman" w:hAnsi="Courier New" w:cs="Courier New"/>
@@ -5945,6 +5528,62 @@
     <w:p>
       <w:r>
         <w:t>Erklärung</w:t>
+      </w:r>
+      <w:r>
+        <w:t>:</w:t>
+      </w:r>
+    </w:p>
+    <w:p>
+      <w:r>
+        <w:t xml:space="preserve">Im Programm werden zwei </w:t>
+      </w:r>
+      <w:proofErr w:type="spellStart"/>
+      <w:r>
+        <w:t>CardBoard</w:t>
+      </w:r>
+      <w:proofErr w:type="spellEnd"/>
+      <w:r>
+        <w:t xml:space="preserve">-Objekte erzeugt, von denen jedes ein eigenes Short-Objekt enthält. Insgesamt existieren daher vier Objekte im Heap. Die Methode </w:t>
+      </w:r>
+      <w:proofErr w:type="spellStart"/>
+      <w:r>
+        <w:t>go</w:t>
+      </w:r>
+      <w:proofErr w:type="spellEnd"/>
+      <w:r>
+        <w:t xml:space="preserve">() gibt immer null zurück und verändert c2 nicht, da die Variable </w:t>
+      </w:r>
+      <w:proofErr w:type="spellStart"/>
+      <w:r>
+        <w:t>cb</w:t>
+      </w:r>
+      <w:proofErr w:type="spellEnd"/>
+      <w:r>
+        <w:t xml:space="preserve"> nur eine lokale Kopie der Referenz ist. Nachdem c1 auf null gesetzt wurde, gibt es keine Referenz mehr auf das erste </w:t>
+      </w:r>
+      <w:proofErr w:type="spellStart"/>
+      <w:r>
+        <w:t>CardBoard</w:t>
+      </w:r>
+      <w:proofErr w:type="spellEnd"/>
+      <w:r>
+        <w:t xml:space="preserve">-Objekt (Objekt A). Da damit auch das zugehörige Short-Objekt nicht mehr erreichbar ist, sind genau zwei Objekte </w:t>
+      </w:r>
+      <w:proofErr w:type="spellStart"/>
+      <w:r>
+        <w:t>garbage-collection-eligible</w:t>
+      </w:r>
+      <w:proofErr w:type="spellEnd"/>
+      <w:r>
+        <w:t xml:space="preserve">: das </w:t>
+      </w:r>
+      <w:proofErr w:type="spellStart"/>
+      <w:r>
+        <w:t>CardBoard</w:t>
+      </w:r>
+      <w:proofErr w:type="spellEnd"/>
+      <w:r>
+        <w:t>-Objekt A und das darin enthaltene Short-Objekt SA. Die restlichen Objekte bleiben über die Variable c2 erreichbar.</w:t>
       </w:r>
     </w:p>
     <w:sectPr>

</xml_diff>